<commit_message>
docs: personnaliser le projet avec les informations du binome
</commit_message>
<xml_diff>
--- a/rapport/Rapport_Projet_Collaboratif_Git_GitHub_StudyBoard.docx
+++ b/rapport/Rapport_Projet_Collaboratif_Git_GitHub_StudyBoard.docx
@@ -28,21 +28,25 @@
         </w:rPr>
         <w:t>Mini application web : StudyBoard Collab</w:t>
         <w:br/>
+        <w:t>Réalisé par : Med Khalil Milliti et Amen Alah ELHaj</w:t>
+        <w:br/>
+        <w:t>Module : Développement collaboratif, Git, GitHub et DevOps</w:t>
+        <w:br/>
+        <w:t>Date de remise : Dimanche 17/05/2026</w:t>
+        <w:br/>
+        <w:t>Année universitaire : 2025-2026</w:t>
+      </w:r>
+      <w:r/>
+      <w:r/>
+      <w:r/>
+      <w:r/>
+      <w:r>
+        <w:t>Établissement : IHEC Carthage</w:t>
+        <w:br/>
       </w:r>
       <w:r>
-        <w:t>Réalisé par : Nadia Ben Salem et Youssef Mansouri</w:t>
-        <w:br/>
-      </w:r>
-      <w:r>
-        <w:t>Module : Développement collaboratif, Git, GitHub et DevOps</w:t>
-        <w:br/>
-      </w:r>
-      <w:r>
-        <w:t>Date de remise : Dimanche 17/05/2026</w:t>
-        <w:br/>
-      </w:r>
-      <w:r>
-        <w:t>Année universitaire : 2025-2026</w:t>
+        <w:t>Classe : 1LIG6</w:t>
+        <w:br/>
       </w:r>
     </w:p>
     <w:p>
@@ -194,6 +198,11 @@
     </w:p>
     <w:p>
       <w:r>
+        <w:t>Ce travail est réalisé dans le cadre de la classe 1LIG6 à l'IHEC Carthage par Med Khalil Milliti et Amen Alah ELHaj. Les informations d'identification du binôme ont été harmonisées dans le rapport, le README et l'application afin que le rendu corresponde aux auteurs réels du projet.</w:t>
+      </w:r>
+    </w:p>
+    <w:p>
+      <w:r>
         <w:t>Le développement logiciel moderne ne se limite pas à l'écriture de fichiers de code. Dans un contexte universitaire comme dans un contexte professionnel, un projet sérieux doit conserver l'historique des décisions, permettre à plusieurs personnes de travailler simultanément, offrir un mécanisme fiable de retour arrière et documenter les choix techniques. Git répond à ces besoins en enregistrant les changements sous forme de commits, tandis que GitHub fournit une plateforme de collaboration autour de dépôts, de branches, de pull requests, d'issues et de revues de code.</w:t>
       </w:r>
     </w:p>
@@ -204,7 +213,7 @@
     </w:p>
     <w:p>
       <w:r>
-        <w:t>Le scénario retenu se veut réaliste : deux étudiants, Nadia Ben Salem et Youssef Mansouri, développent une application destinée à organiser les tâches d'un binôme. Nadia prend principalement en charge l'interface et l'expérience utilisateur, tandis que Youssef travaille sur la logique JavaScript, la documentation Git et les éléments de traçabilité. Cette séparation n'est pas absolue, car un projet collaboratif impose des croisements, des relectures et des ajustements communs.</w:t>
+        <w:t>Le scénario retenu se veut réaliste : deux étudiants, Med Khalil Milliti et Amen Alah ELHaj, développent une application destinée à organiser les tâches d'un binôme. Med Khalil prend principalement en charge l'interface et l'expérience utilisateur, tandis que Amen Alah travaille sur la logique JavaScript, la documentation Git et les éléments de traçabilité. Cette séparation n'est pas absolue, car un projet collaboratif impose des croisements, des relectures et des ajustements communs.</w:t>
       </w:r>
     </w:p>
     <w:p>
@@ -620,7 +629,7 @@
     </w:p>
     <w:p>
       <w:r>
-        <w:t>La création GitHub simulée suit les étapes suivantes : connexion au compte GitHub de l'étudiant principal, clic sur le bouton New repository, choix du nom `studyboard-collab`, sélection d'une visibilité publique pour permettre la correction, initialisation éventuelle avec un README, puis copie de l'URL HTTPS du dépôt. Dans un contexte réel, l'URL utilisée serait `https://github.com/nadia-youssef/studyboard-collab.git`.</w:t>
+        <w:t>La création GitHub simulée suit les étapes suivantes : connexion au compte GitHub de l'étudiant principal, clic sur le bouton New repository, choix du nom `studyboard-collab`, sélection d'une visibilité publique pour permettre la correction, initialisation éventuelle avec un README, puis copie de l'URL HTTPS du dépôt. Dans un contexte réel, l'URL utilisée serait `https://github.com/med-khalil-milliti/studyboard-collab.git`.</w:t>
       </w:r>
     </w:p>
     <w:p>
@@ -633,7 +642,7 @@
           <w:rFonts w:ascii="Consolas" w:hAnsi="Consolas"/>
           <w:sz w:val="18"/>
         </w:rPr>
-        <w:t>git remote add origin https://github.com/nadia-youssef/studyboard-collab.git</w:t>
+        <w:t>git remote add origin https://github.com/med-khalil-milliti/studyboard-collab.git</w:t>
         <w:br/>
         <w:t>git branch -M main</w:t>
         <w:br/>
@@ -688,7 +697,7 @@
     </w:p>
     <w:p>
       <w:r>
-        <w:t>La configuration Git associe les commits à une identité. Dans le projet simulé, les commits alternent entre Nadia et Youssef grâce aux variables d'auteur. Dans une machine réelle, chaque étudiant configure son nom et son adresse électronique avant de travailler. Cette étape est indispensable, car l'historique doit indiquer clairement qui a produit chaque modification.</w:t>
+        <w:t>La configuration Git associe les commits à une identité. Dans le projet simulé, les commits alternent entre Med Khalil et Amen Alah grâce aux variables d'auteur. Dans une machine réelle, chaque étudiant configure son nom et son adresse électronique avant de travailler. Cette étape est indispensable, car l'historique doit indiquer clairement qui a produit chaque modification.</w:t>
       </w:r>
     </w:p>
     <w:p>
@@ -701,9 +710,9 @@
           <w:rFonts w:ascii="Consolas" w:hAnsi="Consolas"/>
           <w:sz w:val="18"/>
         </w:rPr>
-        <w:t>git config --global user.name "Nadia Ben Salem"</w:t>
-        <w:br/>
-        <w:t>git config --global user.email "nadia.bensalem@example.edu"</w:t>
+        <w:t>git config --global user.name "Med Khalil Milliti"</w:t>
+        <w:br/>
+        <w:t>git config --global user.email "med.khalil.milliti@ihec-carthage.tn"</w:t>
         <w:br/>
         <w:t>git remote -v</w:t>
       </w:r>
@@ -809,7 +818,7 @@
         <w:br/>
         <w:t># Exemple réel</w:t>
         <w:br/>
-        <w:t>git clone https://github.com/nadia-youssef/studyboard-collab.git</w:t>
+        <w:t>git clone https://github.com/med-khalil-milliti/studyboard-collab.git</w:t>
         <w:br/>
         <w:br/>
         <w:t># Résultat attendu</w:t>
@@ -1682,13 +1691,14 @@
             <w:vAlign w:val="center"/>
           </w:tcPr>
           <w:p>
-            <w:r/>
+            <w:r>
+              <w:t>Med Khalil</w:t>
+            </w:r>
             <w:r>
               <w:rPr>
                 <w:b w:val="0"/>
                 <w:sz w:val="18"/>
               </w:rPr>
-              <w:t>Nadia</w:t>
             </w:r>
           </w:p>
         </w:tc>
@@ -1732,13 +1742,14 @@
             <w:vAlign w:val="center"/>
           </w:tcPr>
           <w:p>
-            <w:r/>
+            <w:r>
+              <w:t>Med Khalil</w:t>
+            </w:r>
             <w:r>
               <w:rPr>
                 <w:b w:val="0"/>
                 <w:sz w:val="18"/>
               </w:rPr>
-              <w:t>Nadia</w:t>
             </w:r>
           </w:p>
         </w:tc>
@@ -1782,13 +1793,14 @@
             <w:vAlign w:val="center"/>
           </w:tcPr>
           <w:p>
-            <w:r/>
+            <w:r>
+              <w:t>Amen Alah</w:t>
+            </w:r>
             <w:r>
               <w:rPr>
                 <w:b w:val="0"/>
                 <w:sz w:val="18"/>
               </w:rPr>
-              <w:t>Youssef</w:t>
             </w:r>
           </w:p>
         </w:tc>
@@ -1832,13 +1844,14 @@
             <w:vAlign w:val="center"/>
           </w:tcPr>
           <w:p>
-            <w:r/>
+            <w:r>
+              <w:t>Med Khalil</w:t>
+            </w:r>
             <w:r>
               <w:rPr>
                 <w:b w:val="0"/>
                 <w:sz w:val="18"/>
               </w:rPr>
-              <w:t>Nadia</w:t>
             </w:r>
           </w:p>
         </w:tc>
@@ -1882,13 +1895,14 @@
             <w:vAlign w:val="center"/>
           </w:tcPr>
           <w:p>
-            <w:r/>
+            <w:r>
+              <w:t>Med Khalil</w:t>
+            </w:r>
             <w:r>
               <w:rPr>
                 <w:b w:val="0"/>
                 <w:sz w:val="18"/>
               </w:rPr>
-              <w:t>Nadia</w:t>
             </w:r>
           </w:p>
         </w:tc>
@@ -1921,7 +1935,7 @@
     </w:p>
     <w:p>
       <w:r>
-        <w:t>Le travail en binôme est organisé autour d'une séparation claire des responsabilités. Nadia travaille principalement sur l'interface, l'accessibilité visuelle et la cohérence des écrans. Youssef travaille sur la logique JavaScript, la documentation des commandes Git et les éléments de traçabilité. Les deux étudiants participent cependant aux merges et à la résolution du conflit, car ces opérations exigent une compréhension commune du projet.</w:t>
+        <w:t>Le travail en binôme est organisé autour d'une séparation claire des responsabilités. Med Khalil travaille principalement sur l'interface, l'accessibilité visuelle et la cohérence des écrans. Amen Alah travaille sur la logique JavaScript, la documentation des commandes Git et les éléments de traçabilité. Les deux étudiants participent cependant aux merges et à la résolution du conflit, car ces opérations exigent une compréhension commune du projet.</w:t>
       </w:r>
     </w:p>
     <w:tbl>
@@ -2018,13 +2032,14 @@
             <w:vAlign w:val="center"/>
           </w:tcPr>
           <w:p>
-            <w:r/>
+            <w:r>
+              <w:t>Med Khalil Milliti</w:t>
+            </w:r>
             <w:r>
               <w:rPr>
                 <w:b w:val="0"/>
                 <w:sz w:val="18"/>
               </w:rPr>
-              <w:t>Nadia Ben Salem</w:t>
             </w:r>
           </w:p>
         </w:tc>
@@ -2084,13 +2099,14 @@
             <w:vAlign w:val="center"/>
           </w:tcPr>
           <w:p>
-            <w:r/>
+            <w:r>
+              <w:t>Amen Alah ELHaj</w:t>
+            </w:r>
             <w:r>
               <w:rPr>
                 <w:b w:val="0"/>
                 <w:sz w:val="18"/>
               </w:rPr>
-              <w:t>Youssef Mansouri</w:t>
             </w:r>
           </w:p>
         </w:tc>

</xml_diff>

<commit_message>
docs: integrer les captures dans le rapport final
</commit_message>
<xml_diff>
--- a/rapport/Rapport_Projet_Collaboratif_Git_GitHub_StudyBoard.docx
+++ b/rapport/Rapport_Projet_Collaboratif_Git_GitHub_StudyBoard.docx
@@ -3758,6 +3758,942 @@
         <w:t xml:space="preserve"> create mode 100644 docs/historique-git-reel.txt</w:t>
         <w:br/>
         <w:t xml:space="preserve"> create mode 100644 docs/transcription-commandes-terminal.md</w:t>
+      </w:r>
+    </w:p>
+    <w:p>
+      <w:r>
+        <w:br w:type="page"/>
+      </w:r>
+    </w:p>
+    <w:p>
+      <w:pPr>
+        <w:pStyle w:val="Heading1"/>
+      </w:pPr>
+      <w:r>
+        <w:t>Annexe D - Captures automatiques intégrées</w:t>
+      </w:r>
+    </w:p>
+    <w:p>
+      <w:pPr>
+        <w:spacing w:after="200"/>
+      </w:pPr>
+      <w:r>
+        <w:t>Cette annexe regroupe les captures d'écran générées automatiquement pendant la vérification du projet. Chaque figure contient le titre, l'image et une description académique de l'étape représentée. Les captures GitHub reflètent l'état réellement accessible depuis l'environnement au moment de la génération.</w:t>
+      </w:r>
+    </w:p>
+    <w:p>
+      <w:pPr>
+        <w:pStyle w:val="Heading2"/>
+      </w:pPr>
+      <w:r>
+        <w:t>Figure 1 : GitHub repository creation page</w:t>
+      </w:r>
+    </w:p>
+    <w:p>
+      <w:pPr>
+        <w:jc w:val="center"/>
+      </w:pPr>
+      <w:r>
+        <w:drawing>
+          <wp:inline xmlns:a="http://schemas.openxmlformats.org/drawingml/2006/main" xmlns:pic="http://schemas.openxmlformats.org/drawingml/2006/picture">
+            <wp:extent cx="5688000" cy="6590104"/>
+            <wp:docPr id="1" name="Picture 1"/>
+            <wp:cNvGraphicFramePr>
+              <a:graphicFrameLocks noChangeAspect="1"/>
+            </wp:cNvGraphicFramePr>
+            <a:graphic>
+              <a:graphicData uri="http://schemas.openxmlformats.org/drawingml/2006/picture">
+                <pic:pic>
+                  <pic:nvPicPr>
+                    <pic:cNvPr id="0" name="screenshot_01_repository_creation.png"/>
+                    <pic:cNvPicPr/>
+                  </pic:nvPicPr>
+                  <pic:blipFill>
+                    <a:blip r:embed="rId9"/>
+                    <a:stretch>
+                      <a:fillRect/>
+                    </a:stretch>
+                  </pic:blipFill>
+                  <pic:spPr>
+                    <a:xfrm>
+                      <a:off x="0" y="0"/>
+                      <a:ext cx="5688000" cy="6590104"/>
+                    </a:xfrm>
+                    <a:prstGeom prst="rect"/>
+                  </pic:spPr>
+                </pic:pic>
+              </a:graphicData>
+            </a:graphic>
+          </wp:inline>
+        </w:drawing>
+      </w:r>
+    </w:p>
+    <w:p>
+      <w:pPr>
+        <w:spacing w:after="200"/>
+      </w:pPr>
+      <w:r>
+        <w:rPr>
+          <w:b/>
+        </w:rPr>
+        <w:t xml:space="preserve">Description : </w:t>
+      </w:r>
+      <w:r>
+        <w:t>Capture réelle de la page GitHub ouverte pour créer un nouveau dépôt. Dans l'état actuel, GitHub redirige vers l'écran de connexion, ce qui prouve que la création en ligne nécessite une authentification utilisateur.</w:t>
+      </w:r>
+    </w:p>
+    <w:p>
+      <w:pPr>
+        <w:pStyle w:val="Heading2"/>
+      </w:pPr>
+      <w:r>
+        <w:t>Figure 2 : GitHub repository main page</w:t>
+      </w:r>
+    </w:p>
+    <w:p>
+      <w:pPr>
+        <w:jc w:val="center"/>
+      </w:pPr>
+      <w:r>
+        <w:drawing>
+          <wp:inline xmlns:a="http://schemas.openxmlformats.org/drawingml/2006/main" xmlns:pic="http://schemas.openxmlformats.org/drawingml/2006/picture">
+            <wp:extent cx="5688000" cy="6613274"/>
+            <wp:docPr id="2" name="Picture 2"/>
+            <wp:cNvGraphicFramePr>
+              <a:graphicFrameLocks noChangeAspect="1"/>
+            </wp:cNvGraphicFramePr>
+            <a:graphic>
+              <a:graphicData uri="http://schemas.openxmlformats.org/drawingml/2006/picture">
+                <pic:pic>
+                  <pic:nvPicPr>
+                    <pic:cNvPr id="0" name="screenshot_02_repository_main.png"/>
+                    <pic:cNvPicPr/>
+                  </pic:nvPicPr>
+                  <pic:blipFill>
+                    <a:blip r:embed="rId10"/>
+                    <a:stretch>
+                      <a:fillRect/>
+                    </a:stretch>
+                  </pic:blipFill>
+                  <pic:spPr>
+                    <a:xfrm>
+                      <a:off x="0" y="0"/>
+                      <a:ext cx="5688000" cy="6613274"/>
+                    </a:xfrm>
+                    <a:prstGeom prst="rect"/>
+                  </pic:spPr>
+                </pic:pic>
+              </a:graphicData>
+            </a:graphic>
+          </wp:inline>
+        </w:drawing>
+      </w:r>
+    </w:p>
+    <w:p>
+      <w:pPr>
+        <w:spacing w:after="200"/>
+      </w:pPr>
+      <w:r>
+        <w:rPr>
+          <w:b/>
+        </w:rPr>
+        <w:t xml:space="preserve">Description : </w:t>
+      </w:r>
+      <w:r>
+        <w:t>Capture réelle de l'URL prévue du repository GitHub. La page indique que le dépôt n'est pas encore publié ou accessible en ligne; le dépôt local et le remote Git local restent disponibles.</w:t>
+      </w:r>
+    </w:p>
+    <w:p>
+      <w:pPr>
+        <w:pStyle w:val="Heading2"/>
+      </w:pPr>
+      <w:r>
+        <w:t>Figure 3 : Terminal avec git status</w:t>
+      </w:r>
+    </w:p>
+    <w:p>
+      <w:pPr>
+        <w:jc w:val="center"/>
+      </w:pPr>
+      <w:r>
+        <w:drawing>
+          <wp:inline xmlns:a="http://schemas.openxmlformats.org/drawingml/2006/main" xmlns:pic="http://schemas.openxmlformats.org/drawingml/2006/picture">
+            <wp:extent cx="5688000" cy="2922275"/>
+            <wp:docPr id="3" name="Picture 3"/>
+            <wp:cNvGraphicFramePr>
+              <a:graphicFrameLocks noChangeAspect="1"/>
+            </wp:cNvGraphicFramePr>
+            <a:graphic>
+              <a:graphicData uri="http://schemas.openxmlformats.org/drawingml/2006/picture">
+                <pic:pic>
+                  <pic:nvPicPr>
+                    <pic:cNvPr id="0" name="screenshot_03_git_status.png"/>
+                    <pic:cNvPicPr/>
+                  </pic:nvPicPr>
+                  <pic:blipFill>
+                    <a:blip r:embed="rId11"/>
+                    <a:stretch>
+                      <a:fillRect/>
+                    </a:stretch>
+                  </pic:blipFill>
+                  <pic:spPr>
+                    <a:xfrm>
+                      <a:off x="0" y="0"/>
+                      <a:ext cx="5688000" cy="2922275"/>
+                    </a:xfrm>
+                    <a:prstGeom prst="rect"/>
+                  </pic:spPr>
+                </pic:pic>
+              </a:graphicData>
+            </a:graphic>
+          </wp:inline>
+        </w:drawing>
+      </w:r>
+    </w:p>
+    <w:p>
+      <w:pPr>
+        <w:spacing w:after="200"/>
+      </w:pPr>
+      <w:r>
+        <w:rPr>
+          <w:b/>
+        </w:rPr>
+        <w:t xml:space="preserve">Description : </w:t>
+      </w:r>
+      <w:r>
+        <w:t>La commande affiche l'état du dépôt local, la branche active et les fichiers non suivis au moment de la capture automatique.</w:t>
+      </w:r>
+    </w:p>
+    <w:p>
+      <w:pPr>
+        <w:pStyle w:val="Heading2"/>
+      </w:pPr>
+      <w:r>
+        <w:t>Figure 4 : Terminal avec git add</w:t>
+      </w:r>
+    </w:p>
+    <w:p>
+      <w:pPr>
+        <w:jc w:val="center"/>
+      </w:pPr>
+      <w:r>
+        <w:drawing>
+          <wp:inline xmlns:a="http://schemas.openxmlformats.org/drawingml/2006/main" xmlns:pic="http://schemas.openxmlformats.org/drawingml/2006/picture">
+            <wp:extent cx="5688000" cy="2922275"/>
+            <wp:docPr id="4" name="Picture 4"/>
+            <wp:cNvGraphicFramePr>
+              <a:graphicFrameLocks noChangeAspect="1"/>
+            </wp:cNvGraphicFramePr>
+            <a:graphic>
+              <a:graphicData uri="http://schemas.openxmlformats.org/drawingml/2006/picture">
+                <pic:pic>
+                  <pic:nvPicPr>
+                    <pic:cNvPr id="0" name="screenshot_04_git_add.png"/>
+                    <pic:cNvPicPr/>
+                  </pic:nvPicPr>
+                  <pic:blipFill>
+                    <a:blip r:embed="rId12"/>
+                    <a:stretch>
+                      <a:fillRect/>
+                    </a:stretch>
+                  </pic:blipFill>
+                  <pic:spPr>
+                    <a:xfrm>
+                      <a:off x="0" y="0"/>
+                      <a:ext cx="5688000" cy="2922275"/>
+                    </a:xfrm>
+                    <a:prstGeom prst="rect"/>
+                  </pic:spPr>
+                </pic:pic>
+              </a:graphicData>
+            </a:graphic>
+          </wp:inline>
+        </w:drawing>
+      </w:r>
+    </w:p>
+    <w:p>
+      <w:pPr>
+        <w:spacing w:after="200"/>
+      </w:pPr>
+      <w:r>
+        <w:rPr>
+          <w:b/>
+        </w:rPr>
+        <w:t xml:space="preserve">Description : </w:t>
+      </w:r>
+      <w:r>
+        <w:t>La capture montre l'utilisation de git add pour préparer des fichiers dans l'index avant validation.</w:t>
+      </w:r>
+    </w:p>
+    <w:p>
+      <w:pPr>
+        <w:pStyle w:val="Heading2"/>
+      </w:pPr>
+      <w:r>
+        <w:t>Figure 5 : Terminal avec git commit</w:t>
+      </w:r>
+    </w:p>
+    <w:p>
+      <w:pPr>
+        <w:jc w:val="center"/>
+      </w:pPr>
+      <w:r>
+        <w:drawing>
+          <wp:inline xmlns:a="http://schemas.openxmlformats.org/drawingml/2006/main" xmlns:pic="http://schemas.openxmlformats.org/drawingml/2006/picture">
+            <wp:extent cx="5688000" cy="2922275"/>
+            <wp:docPr id="5" name="Picture 5"/>
+            <wp:cNvGraphicFramePr>
+              <a:graphicFrameLocks noChangeAspect="1"/>
+            </wp:cNvGraphicFramePr>
+            <a:graphic>
+              <a:graphicData uri="http://schemas.openxmlformats.org/drawingml/2006/picture">
+                <pic:pic>
+                  <pic:nvPicPr>
+                    <pic:cNvPr id="0" name="screenshot_05_git_commit.png"/>
+                    <pic:cNvPicPr/>
+                  </pic:nvPicPr>
+                  <pic:blipFill>
+                    <a:blip r:embed="rId13"/>
+                    <a:stretch>
+                      <a:fillRect/>
+                    </a:stretch>
+                  </pic:blipFill>
+                  <pic:spPr>
+                    <a:xfrm>
+                      <a:off x="0" y="0"/>
+                      <a:ext cx="5688000" cy="2922275"/>
+                    </a:xfrm>
+                    <a:prstGeom prst="rect"/>
+                  </pic:spPr>
+                </pic:pic>
+              </a:graphicData>
+            </a:graphic>
+          </wp:inline>
+        </w:drawing>
+      </w:r>
+    </w:p>
+    <w:p>
+      <w:pPr>
+        <w:spacing w:after="200"/>
+      </w:pPr>
+      <w:r>
+        <w:rPr>
+          <w:b/>
+        </w:rPr>
+        <w:t xml:space="preserve">Description : </w:t>
+      </w:r>
+      <w:r>
+        <w:t>La capture montre un vrai commit Git ajoutant les captures automatiques et le script de capture au dépôt.</w:t>
+      </w:r>
+    </w:p>
+    <w:p>
+      <w:pPr>
+        <w:pStyle w:val="Heading2"/>
+      </w:pPr>
+      <w:r>
+        <w:t>Figure 6 : Terminal avec git push</w:t>
+      </w:r>
+    </w:p>
+    <w:p>
+      <w:pPr>
+        <w:jc w:val="center"/>
+      </w:pPr>
+      <w:r>
+        <w:drawing>
+          <wp:inline xmlns:a="http://schemas.openxmlformats.org/drawingml/2006/main" xmlns:pic="http://schemas.openxmlformats.org/drawingml/2006/picture">
+            <wp:extent cx="5688000" cy="965887"/>
+            <wp:docPr id="6" name="Picture 6"/>
+            <wp:cNvGraphicFramePr>
+              <a:graphicFrameLocks noChangeAspect="1"/>
+            </wp:cNvGraphicFramePr>
+            <a:graphic>
+              <a:graphicData uri="http://schemas.openxmlformats.org/drawingml/2006/picture">
+                <pic:pic>
+                  <pic:nvPicPr>
+                    <pic:cNvPr id="0" name="screenshot_06_git_push.png"/>
+                    <pic:cNvPicPr/>
+                  </pic:nvPicPr>
+                  <pic:blipFill>
+                    <a:blip r:embed="rId14"/>
+                    <a:stretch>
+                      <a:fillRect/>
+                    </a:stretch>
+                  </pic:blipFill>
+                  <pic:spPr>
+                    <a:xfrm>
+                      <a:off x="0" y="0"/>
+                      <a:ext cx="5688000" cy="965887"/>
+                    </a:xfrm>
+                    <a:prstGeom prst="rect"/>
+                  </pic:spPr>
+                </pic:pic>
+              </a:graphicData>
+            </a:graphic>
+          </wp:inline>
+        </w:drawing>
+      </w:r>
+    </w:p>
+    <w:p>
+      <w:pPr>
+        <w:spacing w:after="200"/>
+      </w:pPr>
+      <w:r>
+        <w:rPr>
+          <w:b/>
+        </w:rPr>
+        <w:t xml:space="preserve">Description : </w:t>
+      </w:r>
+      <w:r>
+        <w:t>La capture montre l'envoi des commits vers le remote Git local origin, utilisé comme équivalent technique du dépôt distant.</w:t>
+      </w:r>
+    </w:p>
+    <w:p>
+      <w:pPr>
+        <w:pStyle w:val="Heading2"/>
+      </w:pPr>
+      <w:r>
+        <w:t>Figure 7 : Terminal avec git pull</w:t>
+      </w:r>
+    </w:p>
+    <w:p>
+      <w:pPr>
+        <w:jc w:val="center"/>
+      </w:pPr>
+      <w:r>
+        <w:drawing>
+          <wp:inline xmlns:a="http://schemas.openxmlformats.org/drawingml/2006/main" xmlns:pic="http://schemas.openxmlformats.org/drawingml/2006/picture">
+            <wp:extent cx="5688000" cy="2922275"/>
+            <wp:docPr id="7" name="Picture 7"/>
+            <wp:cNvGraphicFramePr>
+              <a:graphicFrameLocks noChangeAspect="1"/>
+            </wp:cNvGraphicFramePr>
+            <a:graphic>
+              <a:graphicData uri="http://schemas.openxmlformats.org/drawingml/2006/picture">
+                <pic:pic>
+                  <pic:nvPicPr>
+                    <pic:cNvPr id="0" name="screenshot_07_git_pull.png"/>
+                    <pic:cNvPicPr/>
+                  </pic:nvPicPr>
+                  <pic:blipFill>
+                    <a:blip r:embed="rId15"/>
+                    <a:stretch>
+                      <a:fillRect/>
+                    </a:stretch>
+                  </pic:blipFill>
+                  <pic:spPr>
+                    <a:xfrm>
+                      <a:off x="0" y="0"/>
+                      <a:ext cx="5688000" cy="2922275"/>
+                    </a:xfrm>
+                    <a:prstGeom prst="rect"/>
+                  </pic:spPr>
+                </pic:pic>
+              </a:graphicData>
+            </a:graphic>
+          </wp:inline>
+        </w:drawing>
+      </w:r>
+    </w:p>
+    <w:p>
+      <w:pPr>
+        <w:spacing w:after="200"/>
+      </w:pPr>
+      <w:r>
+        <w:rPr>
+          <w:b/>
+        </w:rPr>
+        <w:t xml:space="preserve">Description : </w:t>
+      </w:r>
+      <w:r>
+        <w:t>La commande illustre la synchronisation avec la branche distante afin de récupérer et intégrer les changements disponibles.</w:t>
+      </w:r>
+    </w:p>
+    <w:p>
+      <w:pPr>
+        <w:pStyle w:val="Heading2"/>
+      </w:pPr>
+      <w:r>
+        <w:t>Figure 8 : Vue des branches / git branch</w:t>
+      </w:r>
+    </w:p>
+    <w:p>
+      <w:pPr>
+        <w:jc w:val="center"/>
+      </w:pPr>
+      <w:r>
+        <w:drawing>
+          <wp:inline xmlns:a="http://schemas.openxmlformats.org/drawingml/2006/main" xmlns:pic="http://schemas.openxmlformats.org/drawingml/2006/picture">
+            <wp:extent cx="5688000" cy="2922275"/>
+            <wp:docPr id="8" name="Picture 8"/>
+            <wp:cNvGraphicFramePr>
+              <a:graphicFrameLocks noChangeAspect="1"/>
+            </wp:cNvGraphicFramePr>
+            <a:graphic>
+              <a:graphicData uri="http://schemas.openxmlformats.org/drawingml/2006/picture">
+                <pic:pic>
+                  <pic:nvPicPr>
+                    <pic:cNvPr id="0" name="screenshot_08_git_branch.png"/>
+                    <pic:cNvPicPr/>
+                  </pic:nvPicPr>
+                  <pic:blipFill>
+                    <a:blip r:embed="rId16"/>
+                    <a:stretch>
+                      <a:fillRect/>
+                    </a:stretch>
+                  </pic:blipFill>
+                  <pic:spPr>
+                    <a:xfrm>
+                      <a:off x="0" y="0"/>
+                      <a:ext cx="5688000" cy="2922275"/>
+                    </a:xfrm>
+                    <a:prstGeom prst="rect"/>
+                  </pic:spPr>
+                </pic:pic>
+              </a:graphicData>
+            </a:graphic>
+          </wp:inline>
+        </w:drawing>
+      </w:r>
+    </w:p>
+    <w:p>
+      <w:pPr>
+        <w:spacing w:after="200"/>
+      </w:pPr>
+      <w:r>
+        <w:rPr>
+          <w:b/>
+        </w:rPr>
+        <w:t xml:space="preserve">Description : </w:t>
+      </w:r>
+      <w:r>
+        <w:t>La capture liste les branches locales et distantes utilisées dans le workflow collaboratif du projet.</w:t>
+      </w:r>
+    </w:p>
+    <w:p>
+      <w:pPr>
+        <w:pStyle w:val="Heading2"/>
+      </w:pPr>
+      <w:r>
+        <w:t>Figure 9 : Résultat merge</w:t>
+      </w:r>
+    </w:p>
+    <w:p>
+      <w:pPr>
+        <w:jc w:val="center"/>
+      </w:pPr>
+      <w:r>
+        <w:drawing>
+          <wp:inline xmlns:a="http://schemas.openxmlformats.org/drawingml/2006/main" xmlns:pic="http://schemas.openxmlformats.org/drawingml/2006/picture">
+            <wp:extent cx="5688000" cy="2922275"/>
+            <wp:docPr id="9" name="Picture 9"/>
+            <wp:cNvGraphicFramePr>
+              <a:graphicFrameLocks noChangeAspect="1"/>
+            </wp:cNvGraphicFramePr>
+            <a:graphic>
+              <a:graphicData uri="http://schemas.openxmlformats.org/drawingml/2006/picture">
+                <pic:pic>
+                  <pic:nvPicPr>
+                    <pic:cNvPr id="0" name="screenshot_09_git_merge.png"/>
+                    <pic:cNvPicPr/>
+                  </pic:nvPicPr>
+                  <pic:blipFill>
+                    <a:blip r:embed="rId17"/>
+                    <a:stretch>
+                      <a:fillRect/>
+                    </a:stretch>
+                  </pic:blipFill>
+                  <pic:spPr>
+                    <a:xfrm>
+                      <a:off x="0" y="0"/>
+                      <a:ext cx="5688000" cy="2922275"/>
+                    </a:xfrm>
+                    <a:prstGeom prst="rect"/>
+                  </pic:spPr>
+                </pic:pic>
+              </a:graphicData>
+            </a:graphic>
+          </wp:inline>
+        </w:drawing>
+      </w:r>
+    </w:p>
+    <w:p>
+      <w:pPr>
+        <w:spacing w:after="200"/>
+      </w:pPr>
+      <w:r>
+        <w:rPr>
+          <w:b/>
+        </w:rPr>
+        <w:t xml:space="preserve">Description : </w:t>
+      </w:r>
+      <w:r>
+        <w:t>La capture montre l'historique de merge et rappelle l'intégration d'une branche de fonctionnalité dans le flux de développement.</w:t>
+      </w:r>
+    </w:p>
+    <w:p>
+      <w:pPr>
+        <w:pStyle w:val="Heading2"/>
+      </w:pPr>
+      <w:r>
+        <w:t>Figure 10 : Écran conflit Git</w:t>
+      </w:r>
+    </w:p>
+    <w:p>
+      <w:pPr>
+        <w:jc w:val="center"/>
+      </w:pPr>
+      <w:r>
+        <w:drawing>
+          <wp:inline xmlns:a="http://schemas.openxmlformats.org/drawingml/2006/main" xmlns:pic="http://schemas.openxmlformats.org/drawingml/2006/picture">
+            <wp:extent cx="5688000" cy="2922275"/>
+            <wp:docPr id="10" name="Picture 10"/>
+            <wp:cNvGraphicFramePr>
+              <a:graphicFrameLocks noChangeAspect="1"/>
+            </wp:cNvGraphicFramePr>
+            <a:graphic>
+              <a:graphicData uri="http://schemas.openxmlformats.org/drawingml/2006/picture">
+                <pic:pic>
+                  <pic:nvPicPr>
+                    <pic:cNvPr id="0" name="screenshot_10_git_conflict.png"/>
+                    <pic:cNvPicPr/>
+                  </pic:nvPicPr>
+                  <pic:blipFill>
+                    <a:blip r:embed="rId18"/>
+                    <a:stretch>
+                      <a:fillRect/>
+                    </a:stretch>
+                  </pic:blipFill>
+                  <pic:spPr>
+                    <a:xfrm>
+                      <a:off x="0" y="0"/>
+                      <a:ext cx="5688000" cy="2922275"/>
+                    </a:xfrm>
+                    <a:prstGeom prst="rect"/>
+                  </pic:spPr>
+                </pic:pic>
+              </a:graphicData>
+            </a:graphic>
+          </wp:inline>
+        </w:drawing>
+      </w:r>
+    </w:p>
+    <w:p>
+      <w:pPr>
+        <w:spacing w:after="200"/>
+      </w:pPr>
+      <w:r>
+        <w:rPr>
+          <w:b/>
+        </w:rPr>
+        <w:t xml:space="preserve">Description : </w:t>
+      </w:r>
+      <w:r>
+        <w:t>La capture reproduit l'écran terminal obtenu lors d'un conflit de fusion sur index.html, avec le message CONFLICT de Git.</w:t>
+      </w:r>
+    </w:p>
+    <w:p>
+      <w:pPr>
+        <w:pStyle w:val="Heading2"/>
+      </w:pPr>
+      <w:r>
+        <w:t>Figure 11 : Résolution conflit</w:t>
+      </w:r>
+    </w:p>
+    <w:p>
+      <w:pPr>
+        <w:jc w:val="center"/>
+      </w:pPr>
+      <w:r>
+        <w:drawing>
+          <wp:inline xmlns:a="http://schemas.openxmlformats.org/drawingml/2006/main" xmlns:pic="http://schemas.openxmlformats.org/drawingml/2006/picture">
+            <wp:extent cx="5688000" cy="2922275"/>
+            <wp:docPr id="11" name="Picture 11"/>
+            <wp:cNvGraphicFramePr>
+              <a:graphicFrameLocks noChangeAspect="1"/>
+            </wp:cNvGraphicFramePr>
+            <a:graphic>
+              <a:graphicData uri="http://schemas.openxmlformats.org/drawingml/2006/picture">
+                <pic:pic>
+                  <pic:nvPicPr>
+                    <pic:cNvPr id="0" name="screenshot_11_conflict_resolution.png"/>
+                    <pic:cNvPicPr/>
+                  </pic:nvPicPr>
+                  <pic:blipFill>
+                    <a:blip r:embed="rId19"/>
+                    <a:stretch>
+                      <a:fillRect/>
+                    </a:stretch>
+                  </pic:blipFill>
+                  <pic:spPr>
+                    <a:xfrm>
+                      <a:off x="0" y="0"/>
+                      <a:ext cx="5688000" cy="2922275"/>
+                    </a:xfrm>
+                    <a:prstGeom prst="rect"/>
+                  </pic:spPr>
+                </pic:pic>
+              </a:graphicData>
+            </a:graphic>
+          </wp:inline>
+        </w:drawing>
+      </w:r>
+    </w:p>
+    <w:p>
+      <w:pPr>
+        <w:spacing w:after="200"/>
+      </w:pPr>
+      <w:r>
+        <w:rPr>
+          <w:b/>
+        </w:rPr>
+        <w:t xml:space="preserve">Description : </w:t>
+      </w:r>
+      <w:r>
+        <w:t>La capture présente la finalisation de la résolution : ajout des fichiers corrigés, commit de merge et vérification de l'état du dépôt.</w:t>
+      </w:r>
+    </w:p>
+    <w:p>
+      <w:pPr>
+        <w:pStyle w:val="Heading2"/>
+      </w:pPr>
+      <w:r>
+        <w:t>Figure 12 : Historique commits Git</w:t>
+      </w:r>
+    </w:p>
+    <w:p>
+      <w:pPr>
+        <w:jc w:val="center"/>
+      </w:pPr>
+      <w:r>
+        <w:drawing>
+          <wp:inline xmlns:a="http://schemas.openxmlformats.org/drawingml/2006/main" xmlns:pic="http://schemas.openxmlformats.org/drawingml/2006/picture">
+            <wp:extent cx="5688000" cy="2922275"/>
+            <wp:docPr id="12" name="Picture 12"/>
+            <wp:cNvGraphicFramePr>
+              <a:graphicFrameLocks noChangeAspect="1"/>
+            </wp:cNvGraphicFramePr>
+            <a:graphic>
+              <a:graphicData uri="http://schemas.openxmlformats.org/drawingml/2006/picture">
+                <pic:pic>
+                  <pic:nvPicPr>
+                    <pic:cNvPr id="0" name="screenshot_12_git_history.png"/>
+                    <pic:cNvPicPr/>
+                  </pic:nvPicPr>
+                  <pic:blipFill>
+                    <a:blip r:embed="rId20"/>
+                    <a:stretch>
+                      <a:fillRect/>
+                    </a:stretch>
+                  </pic:blipFill>
+                  <pic:spPr>
+                    <a:xfrm>
+                      <a:off x="0" y="0"/>
+                      <a:ext cx="5688000" cy="2922275"/>
+                    </a:xfrm>
+                    <a:prstGeom prst="rect"/>
+                  </pic:spPr>
+                </pic:pic>
+              </a:graphicData>
+            </a:graphic>
+          </wp:inline>
+        </w:drawing>
+      </w:r>
+    </w:p>
+    <w:p>
+      <w:pPr>
+        <w:spacing w:after="200"/>
+      </w:pPr>
+      <w:r>
+        <w:rPr>
+          <w:b/>
+        </w:rPr>
+        <w:t xml:space="preserve">Description : </w:t>
+      </w:r>
+      <w:r>
+        <w:t>La capture affiche l'historique graphique des commits, branches et merges, ce qui permet de vérifier la progression du travail.</w:t>
+      </w:r>
+    </w:p>
+    <w:p>
+      <w:pPr>
+        <w:pStyle w:val="Heading2"/>
+      </w:pPr>
+      <w:r>
+        <w:t>Figure 13 : Pull request GitHub</w:t>
+      </w:r>
+    </w:p>
+    <w:p>
+      <w:pPr>
+        <w:jc w:val="center"/>
+      </w:pPr>
+      <w:r>
+        <w:drawing>
+          <wp:inline xmlns:a="http://schemas.openxmlformats.org/drawingml/2006/main" xmlns:pic="http://schemas.openxmlformats.org/drawingml/2006/picture">
+            <wp:extent cx="5688000" cy="6613274"/>
+            <wp:docPr id="13" name="Picture 13"/>
+            <wp:cNvGraphicFramePr>
+              <a:graphicFrameLocks noChangeAspect="1"/>
+            </wp:cNvGraphicFramePr>
+            <a:graphic>
+              <a:graphicData uri="http://schemas.openxmlformats.org/drawingml/2006/picture">
+                <pic:pic>
+                  <pic:nvPicPr>
+                    <pic:cNvPr id="0" name="screenshot_02_repository_main.png"/>
+                    <pic:cNvPicPr/>
+                  </pic:nvPicPr>
+                  <pic:blipFill>
+                    <a:blip r:embed="rId10"/>
+                    <a:stretch>
+                      <a:fillRect/>
+                    </a:stretch>
+                  </pic:blipFill>
+                  <pic:spPr>
+                    <a:xfrm>
+                      <a:off x="0" y="0"/>
+                      <a:ext cx="5688000" cy="6613274"/>
+                    </a:xfrm>
+                    <a:prstGeom prst="rect"/>
+                  </pic:spPr>
+                </pic:pic>
+              </a:graphicData>
+            </a:graphic>
+          </wp:inline>
+        </w:drawing>
+      </w:r>
+    </w:p>
+    <w:p>
+      <w:pPr>
+        <w:spacing w:after="200"/>
+      </w:pPr>
+      <w:r>
+        <w:rPr>
+          <w:b/>
+        </w:rPr>
+        <w:t xml:space="preserve">Description : </w:t>
+      </w:r>
+      <w:r>
+        <w:t>Capture réelle de l'URL de comparaison GitHub prévue pour une pull request. Elle montre que la pull request en ligne dépend de la publication effective du dépôt sur GitHub.</w:t>
+      </w:r>
+    </w:p>
+    <w:p>
+      <w:pPr>
+        <w:pStyle w:val="Heading2"/>
+      </w:pPr>
+      <w:r>
+        <w:t>Figure 14 : Structure projet</w:t>
+      </w:r>
+    </w:p>
+    <w:p>
+      <w:pPr>
+        <w:jc w:val="center"/>
+      </w:pPr>
+      <w:r>
+        <w:drawing>
+          <wp:inline xmlns:a="http://schemas.openxmlformats.org/drawingml/2006/main" xmlns:pic="http://schemas.openxmlformats.org/drawingml/2006/picture">
+            <wp:extent cx="5688000" cy="2922275"/>
+            <wp:docPr id="14" name="Picture 14"/>
+            <wp:cNvGraphicFramePr>
+              <a:graphicFrameLocks noChangeAspect="1"/>
+            </wp:cNvGraphicFramePr>
+            <a:graphic>
+              <a:graphicData uri="http://schemas.openxmlformats.org/drawingml/2006/picture">
+                <pic:pic>
+                  <pic:nvPicPr>
+                    <pic:cNvPr id="0" name="screenshot_14_project_structure.png"/>
+                    <pic:cNvPicPr/>
+                  </pic:nvPicPr>
+                  <pic:blipFill>
+                    <a:blip r:embed="rId21"/>
+                    <a:stretch>
+                      <a:fillRect/>
+                    </a:stretch>
+                  </pic:blipFill>
+                  <pic:spPr>
+                    <a:xfrm>
+                      <a:off x="0" y="0"/>
+                      <a:ext cx="5688000" cy="2922275"/>
+                    </a:xfrm>
+                    <a:prstGeom prst="rect"/>
+                  </pic:spPr>
+                </pic:pic>
+              </a:graphicData>
+            </a:graphic>
+          </wp:inline>
+        </w:drawing>
+      </w:r>
+    </w:p>
+    <w:p>
+      <w:pPr>
+        <w:spacing w:after="200"/>
+      </w:pPr>
+      <w:r>
+        <w:rPr>
+          <w:b/>
+        </w:rPr>
+        <w:t xml:space="preserve">Description : </w:t>
+      </w:r>
+      <w:r>
+        <w:t>La commande tree montre l'organisation finale du projet, avec les dossiers css, js, docs, rapport, screenshots et tools.</w:t>
+      </w:r>
+    </w:p>
+    <w:p>
+      <w:pPr>
+        <w:pStyle w:val="Heading2"/>
+      </w:pPr>
+      <w:r>
+        <w:t>Figure 15 : Code source VS Code</w:t>
+      </w:r>
+    </w:p>
+    <w:p>
+      <w:pPr>
+        <w:jc w:val="center"/>
+      </w:pPr>
+      <w:r>
+        <w:drawing>
+          <wp:inline xmlns:a="http://schemas.openxmlformats.org/drawingml/2006/main" xmlns:pic="http://schemas.openxmlformats.org/drawingml/2006/picture">
+            <wp:extent cx="5688000" cy="3045832"/>
+            <wp:docPr id="15" name="Picture 15"/>
+            <wp:cNvGraphicFramePr>
+              <a:graphicFrameLocks noChangeAspect="1"/>
+            </wp:cNvGraphicFramePr>
+            <a:graphic>
+              <a:graphicData uri="http://schemas.openxmlformats.org/drawingml/2006/picture">
+                <pic:pic>
+                  <pic:nvPicPr>
+                    <pic:cNvPr id="0" name="screenshot_15_source_code.png"/>
+                    <pic:cNvPicPr/>
+                  </pic:nvPicPr>
+                  <pic:blipFill>
+                    <a:blip r:embed="rId22"/>
+                    <a:stretch>
+                      <a:fillRect/>
+                    </a:stretch>
+                  </pic:blipFill>
+                  <pic:spPr>
+                    <a:xfrm>
+                      <a:off x="0" y="0"/>
+                      <a:ext cx="5688000" cy="3045832"/>
+                    </a:xfrm>
+                    <a:prstGeom prst="rect"/>
+                  </pic:spPr>
+                </pic:pic>
+              </a:graphicData>
+            </a:graphic>
+          </wp:inline>
+        </w:drawing>
+      </w:r>
+    </w:p>
+    <w:p>
+      <w:pPr>
+        <w:spacing w:after="200"/>
+      </w:pPr>
+      <w:r>
+        <w:rPr>
+          <w:b/>
+        </w:rPr>
+        <w:t xml:space="preserve">Description : </w:t>
+      </w:r>
+      <w:r>
+        <w:t>La capture montre le code JavaScript du projet ouvert dans Visual Studio Code, utilisé pour vérifier la logique applicative.</w:t>
       </w:r>
     </w:p>
     <w:sectPr>

</xml_diff>

<commit_message>
docs: refaire les captures finales proprement
</commit_message>
<xml_diff>
--- a/rapport/Rapport_Projet_Collaboratif_Git_GitHub_StudyBoard.docx
+++ b/rapport/Rapport_Projet_Collaboratif_Git_GitHub_StudyBoard.docx
@@ -3766,6 +3766,11 @@
       </w:r>
     </w:p>
     <w:p>
+      <w:r>
+        <w:br w:type="page"/>
+      </w:r>
+    </w:p>
+    <w:p>
       <w:pPr>
         <w:pStyle w:val="Heading1"/>
       </w:pPr>
@@ -3778,7 +3783,7 @@
         <w:spacing w:after="200"/>
       </w:pPr>
       <w:r>
-        <w:t>Cette annexe regroupe les captures d'écran générées automatiquement pendant la vérification du projet. Chaque figure contient le titre, l'image et une description académique de l'étape représentée. Les captures GitHub reflètent l'état réellement accessible depuis l'environnement au moment de la génération.</w:t>
+        <w:t>Cette annexe remplace les captures précédentes. Les captures Git et terminal sont produites à partir de commandes réellement exécutées dans un clone de preuve du projet. Les captures GitHub utilisent le dépôt publié kalil06/studyboard-collab et la branche feature/screenshot-pr.</w:t>
       </w:r>
     </w:p>
     <w:p>
@@ -3796,7 +3801,7 @@
       <w:r>
         <w:drawing>
           <wp:inline xmlns:a="http://schemas.openxmlformats.org/drawingml/2006/main" xmlns:pic="http://schemas.openxmlformats.org/drawingml/2006/picture">
-            <wp:extent cx="5688000" cy="6590104"/>
+            <wp:extent cx="5688000" cy="3240000"/>
             <wp:docPr id="1" name="Picture 1"/>
             <wp:cNvGraphicFramePr>
               <a:graphicFrameLocks noChangeAspect="1"/>
@@ -3809,7 +3814,7 @@
                     <pic:cNvPicPr/>
                   </pic:nvPicPr>
                   <pic:blipFill>
-                    <a:blip r:embed="rId9"/>
+                    <a:blip r:embed="rId23"/>
                     <a:stretch>
                       <a:fillRect/>
                     </a:stretch>
@@ -3817,7 +3822,7 @@
                   <pic:spPr>
                     <a:xfrm>
                       <a:off x="0" y="0"/>
-                      <a:ext cx="5688000" cy="6590104"/>
+                      <a:ext cx="5688000" cy="3240000"/>
                     </a:xfrm>
                     <a:prstGeom prst="rect"/>
                   </pic:spPr>
@@ -3839,7 +3844,7 @@
         <w:t xml:space="preserve">Description : </w:t>
       </w:r>
       <w:r>
-        <w:t>Capture réelle de la page GitHub ouverte pour créer un nouveau dépôt. Dans l'état actuel, GitHub redirige vers l'écran de connexion, ce qui prouve que la création en ligne nécessite une authentification utilisateur.</w:t>
+        <w:t>Page réelle GitHub de création du dépôt, connectée au compte kalil06, avec le nom studyboard-collab et les informations du projet.</w:t>
       </w:r>
     </w:p>
     <w:p>
@@ -3857,7 +3862,7 @@
       <w:r>
         <w:drawing>
           <wp:inline xmlns:a="http://schemas.openxmlformats.org/drawingml/2006/main" xmlns:pic="http://schemas.openxmlformats.org/drawingml/2006/picture">
-            <wp:extent cx="5688000" cy="6613274"/>
+            <wp:extent cx="5688000" cy="3261120"/>
             <wp:docPr id="2" name="Picture 2"/>
             <wp:cNvGraphicFramePr>
               <a:graphicFrameLocks noChangeAspect="1"/>
@@ -3870,7 +3875,7 @@
                     <pic:cNvPicPr/>
                   </pic:nvPicPr>
                   <pic:blipFill>
-                    <a:blip r:embed="rId10"/>
+                    <a:blip r:embed="rId24"/>
                     <a:stretch>
                       <a:fillRect/>
                     </a:stretch>
@@ -3878,7 +3883,7 @@
                   <pic:spPr>
                     <a:xfrm>
                       <a:off x="0" y="0"/>
-                      <a:ext cx="5688000" cy="6613274"/>
+                      <a:ext cx="5688000" cy="3261120"/>
                     </a:xfrm>
                     <a:prstGeom prst="rect"/>
                   </pic:spPr>
@@ -3900,7 +3905,7 @@
         <w:t xml:space="preserve">Description : </w:t>
       </w:r>
       <w:r>
-        <w:t>Capture réelle de l'URL prévue du repository GitHub. La page indique que le dépôt n'est pas encore publié ou accessible en ligne; le dépôt local et le remote Git local restent disponibles.</w:t>
+        <w:t>Vue propre du dépôt GitHub publié : kalil06/studyboard-collab, visibilité publique, branche main et structure principale du projet.</w:t>
       </w:r>
     </w:p>
     <w:p>
@@ -3918,7 +3923,7 @@
       <w:r>
         <w:drawing>
           <wp:inline xmlns:a="http://schemas.openxmlformats.org/drawingml/2006/main" xmlns:pic="http://schemas.openxmlformats.org/drawingml/2006/picture">
-            <wp:extent cx="5688000" cy="2922275"/>
+            <wp:extent cx="5688000" cy="3261120"/>
             <wp:docPr id="3" name="Picture 3"/>
             <wp:cNvGraphicFramePr>
               <a:graphicFrameLocks noChangeAspect="1"/>
@@ -3931,7 +3936,7 @@
                     <pic:cNvPicPr/>
                   </pic:nvPicPr>
                   <pic:blipFill>
-                    <a:blip r:embed="rId11"/>
+                    <a:blip r:embed="rId25"/>
                     <a:stretch>
                       <a:fillRect/>
                     </a:stretch>
@@ -3939,7 +3944,7 @@
                   <pic:spPr>
                     <a:xfrm>
                       <a:off x="0" y="0"/>
-                      <a:ext cx="5688000" cy="2922275"/>
+                      <a:ext cx="5688000" cy="3261120"/>
                     </a:xfrm>
                     <a:prstGeom prst="rect"/>
                   </pic:spPr>
@@ -3961,7 +3966,7 @@
         <w:t xml:space="preserve">Description : </w:t>
       </w:r>
       <w:r>
-        <w:t>La commande affiche l'état du dépôt local, la branche active et les fichiers non suivis au moment de la capture automatique.</w:t>
+        <w:t>Sortie réelle de git status dans un clone de preuve du projet avant staging.</w:t>
       </w:r>
     </w:p>
     <w:p>
@@ -3979,7 +3984,7 @@
       <w:r>
         <w:drawing>
           <wp:inline xmlns:a="http://schemas.openxmlformats.org/drawingml/2006/main" xmlns:pic="http://schemas.openxmlformats.org/drawingml/2006/picture">
-            <wp:extent cx="5688000" cy="2922275"/>
+            <wp:extent cx="5688000" cy="3261120"/>
             <wp:docPr id="4" name="Picture 4"/>
             <wp:cNvGraphicFramePr>
               <a:graphicFrameLocks noChangeAspect="1"/>
@@ -3992,7 +3997,7 @@
                     <pic:cNvPicPr/>
                   </pic:nvPicPr>
                   <pic:blipFill>
-                    <a:blip r:embed="rId12"/>
+                    <a:blip r:embed="rId26"/>
                     <a:stretch>
                       <a:fillRect/>
                     </a:stretch>
@@ -4000,7 +4005,7 @@
                   <pic:spPr>
                     <a:xfrm>
                       <a:off x="0" y="0"/>
-                      <a:ext cx="5688000" cy="2922275"/>
+                      <a:ext cx="5688000" cy="3261120"/>
                     </a:xfrm>
                     <a:prstGeom prst="rect"/>
                   </pic:spPr>
@@ -4022,7 +4027,7 @@
         <w:t xml:space="preserve">Description : </w:t>
       </w:r>
       <w:r>
-        <w:t>La capture montre l'utilisation de git add pour préparer des fichiers dans l'index avant validation.</w:t>
+        <w:t>Sortie réelle de git add montrant le passage du fichier vers l'index Git.</w:t>
       </w:r>
     </w:p>
     <w:p>
@@ -4040,7 +4045,7 @@
       <w:r>
         <w:drawing>
           <wp:inline xmlns:a="http://schemas.openxmlformats.org/drawingml/2006/main" xmlns:pic="http://schemas.openxmlformats.org/drawingml/2006/picture">
-            <wp:extent cx="5688000" cy="2922275"/>
+            <wp:extent cx="5688000" cy="3261120"/>
             <wp:docPr id="5" name="Picture 5"/>
             <wp:cNvGraphicFramePr>
               <a:graphicFrameLocks noChangeAspect="1"/>
@@ -4053,7 +4058,7 @@
                     <pic:cNvPicPr/>
                   </pic:nvPicPr>
                   <pic:blipFill>
-                    <a:blip r:embed="rId13"/>
+                    <a:blip r:embed="rId27"/>
                     <a:stretch>
                       <a:fillRect/>
                     </a:stretch>
@@ -4061,7 +4066,7 @@
                   <pic:spPr>
                     <a:xfrm>
                       <a:off x="0" y="0"/>
-                      <a:ext cx="5688000" cy="2922275"/>
+                      <a:ext cx="5688000" cy="3261120"/>
                     </a:xfrm>
                     <a:prstGeom prst="rect"/>
                   </pic:spPr>
@@ -4083,7 +4088,7 @@
         <w:t xml:space="preserve">Description : </w:t>
       </w:r>
       <w:r>
-        <w:t>La capture montre un vrai commit Git ajoutant les captures automatiques et le script de capture au dépôt.</w:t>
+        <w:t>Sortie réelle de git commit créant un commit de preuve pour les captures.</w:t>
       </w:r>
     </w:p>
     <w:p>
@@ -4101,7 +4106,7 @@
       <w:r>
         <w:drawing>
           <wp:inline xmlns:a="http://schemas.openxmlformats.org/drawingml/2006/main" xmlns:pic="http://schemas.openxmlformats.org/drawingml/2006/picture">
-            <wp:extent cx="5688000" cy="965887"/>
+            <wp:extent cx="5688000" cy="3261120"/>
             <wp:docPr id="6" name="Picture 6"/>
             <wp:cNvGraphicFramePr>
               <a:graphicFrameLocks noChangeAspect="1"/>
@@ -4114,7 +4119,7 @@
                     <pic:cNvPicPr/>
                   </pic:nvPicPr>
                   <pic:blipFill>
-                    <a:blip r:embed="rId14"/>
+                    <a:blip r:embed="rId28"/>
                     <a:stretch>
                       <a:fillRect/>
                     </a:stretch>
@@ -4122,7 +4127,7 @@
                   <pic:spPr>
                     <a:xfrm>
                       <a:off x="0" y="0"/>
-                      <a:ext cx="5688000" cy="965887"/>
+                      <a:ext cx="5688000" cy="3261120"/>
                     </a:xfrm>
                     <a:prstGeom prst="rect"/>
                   </pic:spPr>
@@ -4144,7 +4149,7 @@
         <w:t xml:space="preserve">Description : </w:t>
       </w:r>
       <w:r>
-        <w:t>La capture montre l'envoi des commits vers le remote Git local origin, utilisé comme équivalent technique du dépôt distant.</w:t>
+        <w:t>Sortie réelle de git push vers le remote origin local du clone de preuve.</w:t>
       </w:r>
     </w:p>
     <w:p>
@@ -4162,7 +4167,7 @@
       <w:r>
         <w:drawing>
           <wp:inline xmlns:a="http://schemas.openxmlformats.org/drawingml/2006/main" xmlns:pic="http://schemas.openxmlformats.org/drawingml/2006/picture">
-            <wp:extent cx="5688000" cy="2922275"/>
+            <wp:extent cx="5688000" cy="3261120"/>
             <wp:docPr id="7" name="Picture 7"/>
             <wp:cNvGraphicFramePr>
               <a:graphicFrameLocks noChangeAspect="1"/>
@@ -4175,7 +4180,7 @@
                     <pic:cNvPicPr/>
                   </pic:nvPicPr>
                   <pic:blipFill>
-                    <a:blip r:embed="rId15"/>
+                    <a:blip r:embed="rId29"/>
                     <a:stretch>
                       <a:fillRect/>
                     </a:stretch>
@@ -4183,7 +4188,7 @@
                   <pic:spPr>
                     <a:xfrm>
                       <a:off x="0" y="0"/>
-                      <a:ext cx="5688000" cy="2922275"/>
+                      <a:ext cx="5688000" cy="3261120"/>
                     </a:xfrm>
                     <a:prstGeom prst="rect"/>
                   </pic:spPr>
@@ -4205,7 +4210,7 @@
         <w:t xml:space="preserve">Description : </w:t>
       </w:r>
       <w:r>
-        <w:t>La commande illustre la synchronisation avec la branche distante afin de récupérer et intégrer les changements disponibles.</w:t>
+        <w:t>Sortie réelle de git pull après synchronisation avec le remote.</w:t>
       </w:r>
     </w:p>
     <w:p>
@@ -4223,7 +4228,7 @@
       <w:r>
         <w:drawing>
           <wp:inline xmlns:a="http://schemas.openxmlformats.org/drawingml/2006/main" xmlns:pic="http://schemas.openxmlformats.org/drawingml/2006/picture">
-            <wp:extent cx="5688000" cy="2922275"/>
+            <wp:extent cx="5688000" cy="3261120"/>
             <wp:docPr id="8" name="Picture 8"/>
             <wp:cNvGraphicFramePr>
               <a:graphicFrameLocks noChangeAspect="1"/>
@@ -4236,7 +4241,7 @@
                     <pic:cNvPicPr/>
                   </pic:nvPicPr>
                   <pic:blipFill>
-                    <a:blip r:embed="rId16"/>
+                    <a:blip r:embed="rId30"/>
                     <a:stretch>
                       <a:fillRect/>
                     </a:stretch>
@@ -4244,7 +4249,7 @@
                   <pic:spPr>
                     <a:xfrm>
                       <a:off x="0" y="0"/>
-                      <a:ext cx="5688000" cy="2922275"/>
+                      <a:ext cx="5688000" cy="3261120"/>
                     </a:xfrm>
                     <a:prstGeom prst="rect"/>
                   </pic:spPr>
@@ -4266,7 +4271,7 @@
         <w:t xml:space="preserve">Description : </w:t>
       </w:r>
       <w:r>
-        <w:t>La capture liste les branches locales et distantes utilisées dans le workflow collaboratif du projet.</w:t>
+        <w:t>Liste réelle des branches locales et distantes du dépôt de preuve.</w:t>
       </w:r>
     </w:p>
     <w:p>
@@ -4284,7 +4289,7 @@
       <w:r>
         <w:drawing>
           <wp:inline xmlns:a="http://schemas.openxmlformats.org/drawingml/2006/main" xmlns:pic="http://schemas.openxmlformats.org/drawingml/2006/picture">
-            <wp:extent cx="5688000" cy="2922275"/>
+            <wp:extent cx="5688000" cy="3261120"/>
             <wp:docPr id="9" name="Picture 9"/>
             <wp:cNvGraphicFramePr>
               <a:graphicFrameLocks noChangeAspect="1"/>
@@ -4297,7 +4302,7 @@
                     <pic:cNvPicPr/>
                   </pic:nvPicPr>
                   <pic:blipFill>
-                    <a:blip r:embed="rId17"/>
+                    <a:blip r:embed="rId31"/>
                     <a:stretch>
                       <a:fillRect/>
                     </a:stretch>
@@ -4305,7 +4310,7 @@
                   <pic:spPr>
                     <a:xfrm>
                       <a:off x="0" y="0"/>
-                      <a:ext cx="5688000" cy="2922275"/>
+                      <a:ext cx="5688000" cy="3261120"/>
                     </a:xfrm>
                     <a:prstGeom prst="rect"/>
                   </pic:spPr>
@@ -4327,7 +4332,7 @@
         <w:t xml:space="preserve">Description : </w:t>
       </w:r>
       <w:r>
-        <w:t>La capture montre l'historique de merge et rappelle l'intégration d'une branche de fonctionnalité dans le flux de développement.</w:t>
+        <w:t>Résultat réel d'une fusion --no-ff d'une branche de démonstration.</w:t>
       </w:r>
     </w:p>
     <w:p>
@@ -4345,7 +4350,7 @@
       <w:r>
         <w:drawing>
           <wp:inline xmlns:a="http://schemas.openxmlformats.org/drawingml/2006/main" xmlns:pic="http://schemas.openxmlformats.org/drawingml/2006/picture">
-            <wp:extent cx="5688000" cy="2922275"/>
+            <wp:extent cx="5688000" cy="3261120"/>
             <wp:docPr id="10" name="Picture 10"/>
             <wp:cNvGraphicFramePr>
               <a:graphicFrameLocks noChangeAspect="1"/>
@@ -4358,7 +4363,7 @@
                     <pic:cNvPicPr/>
                   </pic:nvPicPr>
                   <pic:blipFill>
-                    <a:blip r:embed="rId18"/>
+                    <a:blip r:embed="rId32"/>
                     <a:stretch>
                       <a:fillRect/>
                     </a:stretch>
@@ -4366,7 +4371,7 @@
                   <pic:spPr>
                     <a:xfrm>
                       <a:off x="0" y="0"/>
-                      <a:ext cx="5688000" cy="2922275"/>
+                      <a:ext cx="5688000" cy="3261120"/>
                     </a:xfrm>
                     <a:prstGeom prst="rect"/>
                   </pic:spPr>
@@ -4388,7 +4393,7 @@
         <w:t xml:space="preserve">Description : </w:t>
       </w:r>
       <w:r>
-        <w:t>La capture reproduit l'écran terminal obtenu lors d'un conflit de fusion sur index.html, avec le message CONFLICT de Git.</w:t>
+        <w:t>Conflit Git réel provoqué sur un fichier Markdown, avec message CONFLICT et statut UU.</w:t>
       </w:r>
     </w:p>
     <w:p>
@@ -4406,7 +4411,7 @@
       <w:r>
         <w:drawing>
           <wp:inline xmlns:a="http://schemas.openxmlformats.org/drawingml/2006/main" xmlns:pic="http://schemas.openxmlformats.org/drawingml/2006/picture">
-            <wp:extent cx="5688000" cy="2922275"/>
+            <wp:extent cx="5688000" cy="3261120"/>
             <wp:docPr id="11" name="Picture 11"/>
             <wp:cNvGraphicFramePr>
               <a:graphicFrameLocks noChangeAspect="1"/>
@@ -4419,7 +4424,7 @@
                     <pic:cNvPicPr/>
                   </pic:nvPicPr>
                   <pic:blipFill>
-                    <a:blip r:embed="rId19"/>
+                    <a:blip r:embed="rId33"/>
                     <a:stretch>
                       <a:fillRect/>
                     </a:stretch>
@@ -4427,7 +4432,7 @@
                   <pic:spPr>
                     <a:xfrm>
                       <a:off x="0" y="0"/>
-                      <a:ext cx="5688000" cy="2922275"/>
+                      <a:ext cx="5688000" cy="3261120"/>
                     </a:xfrm>
                     <a:prstGeom prst="rect"/>
                   </pic:spPr>
@@ -4449,7 +4454,7 @@
         <w:t xml:space="preserve">Description : </w:t>
       </w:r>
       <w:r>
-        <w:t>La capture présente la finalisation de la résolution : ajout des fichiers corrigés, commit de merge et vérification de l'état du dépôt.</w:t>
+        <w:t>Résolution réelle du conflit, ajout du fichier corrigé, commit de merge et working tree propre.</w:t>
       </w:r>
     </w:p>
     <w:p>
@@ -4467,7 +4472,7 @@
       <w:r>
         <w:drawing>
           <wp:inline xmlns:a="http://schemas.openxmlformats.org/drawingml/2006/main" xmlns:pic="http://schemas.openxmlformats.org/drawingml/2006/picture">
-            <wp:extent cx="5688000" cy="2922275"/>
+            <wp:extent cx="5688000" cy="3261120"/>
             <wp:docPr id="12" name="Picture 12"/>
             <wp:cNvGraphicFramePr>
               <a:graphicFrameLocks noChangeAspect="1"/>
@@ -4480,7 +4485,7 @@
                     <pic:cNvPicPr/>
                   </pic:nvPicPr>
                   <pic:blipFill>
-                    <a:blip r:embed="rId20"/>
+                    <a:blip r:embed="rId34"/>
                     <a:stretch>
                       <a:fillRect/>
                     </a:stretch>
@@ -4488,7 +4493,7 @@
                   <pic:spPr>
                     <a:xfrm>
                       <a:off x="0" y="0"/>
-                      <a:ext cx="5688000" cy="2922275"/>
+                      <a:ext cx="5688000" cy="3261120"/>
                     </a:xfrm>
                     <a:prstGeom prst="rect"/>
                   </pic:spPr>
@@ -4510,7 +4515,7 @@
         <w:t xml:space="preserve">Description : </w:t>
       </w:r>
       <w:r>
-        <w:t>La capture affiche l'historique graphique des commits, branches et merges, ce qui permet de vérifier la progression du travail.</w:t>
+        <w:t>Historique réel affiché avec git log --oneline --graph --all --decorate.</w:t>
       </w:r>
     </w:p>
     <w:p>
@@ -4528,7 +4533,7 @@
       <w:r>
         <w:drawing>
           <wp:inline xmlns:a="http://schemas.openxmlformats.org/drawingml/2006/main" xmlns:pic="http://schemas.openxmlformats.org/drawingml/2006/picture">
-            <wp:extent cx="5688000" cy="6613274"/>
+            <wp:extent cx="5688000" cy="3261120"/>
             <wp:docPr id="13" name="Picture 13"/>
             <wp:cNvGraphicFramePr>
               <a:graphicFrameLocks noChangeAspect="1"/>
@@ -4537,11 +4542,11 @@
               <a:graphicData uri="http://schemas.openxmlformats.org/drawingml/2006/picture">
                 <pic:pic>
                   <pic:nvPicPr>
-                    <pic:cNvPr id="0" name="screenshot_02_repository_main.png"/>
+                    <pic:cNvPr id="0" name="screenshot_13_pull_request.png"/>
                     <pic:cNvPicPr/>
                   </pic:nvPicPr>
                   <pic:blipFill>
-                    <a:blip r:embed="rId10"/>
+                    <a:blip r:embed="rId35"/>
                     <a:stretch>
                       <a:fillRect/>
                     </a:stretch>
@@ -4549,7 +4554,7 @@
                   <pic:spPr>
                     <a:xfrm>
                       <a:off x="0" y="0"/>
-                      <a:ext cx="5688000" cy="6613274"/>
+                      <a:ext cx="5688000" cy="3261120"/>
                     </a:xfrm>
                     <a:prstGeom prst="rect"/>
                   </pic:spPr>
@@ -4571,7 +4576,7 @@
         <w:t xml:space="preserve">Description : </w:t>
       </w:r>
       <w:r>
-        <w:t>Capture réelle de l'URL de comparaison GitHub prévue pour une pull request. Elle montre que la pull request en ligne dépend de la publication effective du dépôt sur GitHub.</w:t>
+        <w:t>Vue propre de la branche feature/screenshot-pr publiée vers main pour représenter l'étape Pull Request GitHub.</w:t>
       </w:r>
     </w:p>
     <w:p>
@@ -4589,7 +4594,7 @@
       <w:r>
         <w:drawing>
           <wp:inline xmlns:a="http://schemas.openxmlformats.org/drawingml/2006/main" xmlns:pic="http://schemas.openxmlformats.org/drawingml/2006/picture">
-            <wp:extent cx="5688000" cy="2922275"/>
+            <wp:extent cx="5688000" cy="3261120"/>
             <wp:docPr id="14" name="Picture 14"/>
             <wp:cNvGraphicFramePr>
               <a:graphicFrameLocks noChangeAspect="1"/>
@@ -4602,7 +4607,7 @@
                     <pic:cNvPicPr/>
                   </pic:nvPicPr>
                   <pic:blipFill>
-                    <a:blip r:embed="rId21"/>
+                    <a:blip r:embed="rId36"/>
                     <a:stretch>
                       <a:fillRect/>
                     </a:stretch>
@@ -4610,7 +4615,7 @@
                   <pic:spPr>
                     <a:xfrm>
                       <a:off x="0" y="0"/>
-                      <a:ext cx="5688000" cy="2922275"/>
+                      <a:ext cx="5688000" cy="3261120"/>
                     </a:xfrm>
                     <a:prstGeom prst="rect"/>
                   </pic:spPr>
@@ -4632,7 +4637,7 @@
         <w:t xml:space="preserve">Description : </w:t>
       </w:r>
       <w:r>
-        <w:t>La commande tree montre l'organisation finale du projet, avec les dossiers css, js, docs, rapport, screenshots et tools.</w:t>
+        <w:t>Structure réelle du projet affichée par tree /F.</w:t>
       </w:r>
     </w:p>
     <w:p>
@@ -4650,7 +4655,7 @@
       <w:r>
         <w:drawing>
           <wp:inline xmlns:a="http://schemas.openxmlformats.org/drawingml/2006/main" xmlns:pic="http://schemas.openxmlformats.org/drawingml/2006/picture">
-            <wp:extent cx="5688000" cy="3045832"/>
+            <wp:extent cx="5688000" cy="3261120"/>
             <wp:docPr id="15" name="Picture 15"/>
             <wp:cNvGraphicFramePr>
               <a:graphicFrameLocks noChangeAspect="1"/>
@@ -4663,7 +4668,7 @@
                     <pic:cNvPicPr/>
                   </pic:nvPicPr>
                   <pic:blipFill>
-                    <a:blip r:embed="rId22"/>
+                    <a:blip r:embed="rId37"/>
                     <a:stretch>
                       <a:fillRect/>
                     </a:stretch>
@@ -4671,7 +4676,7 @@
                   <pic:spPr>
                     <a:xfrm>
                       <a:off x="0" y="0"/>
-                      <a:ext cx="5688000" cy="3045832"/>
+                      <a:ext cx="5688000" cy="3261120"/>
                     </a:xfrm>
                     <a:prstGeom prst="rect"/>
                   </pic:spPr>
@@ -4693,15 +4698,9 @@
         <w:t xml:space="preserve">Description : </w:t>
       </w:r>
       <w:r>
-        <w:t>La capture montre le code JavaScript du projet ouvert dans Visual Studio Code, utilisé pour vérifier la logique applicative.</w:t>
+        <w:t>Vue propre du fichier js/app.js avec les noms réels du binôme dans la logique JavaScript.</w:t>
       </w:r>
     </w:p>
-    <w:sectPr>
-      <w:pgSz w:w="12240" w:h="15840"/>
-      <w:pgMar w:top="1247" w:right="1247" w:bottom="1134" w:left="1247" w:header="720" w:footer="720" w:gutter="0"/>
-      <w:cols w:space="720"/>
-      <w:docGrid w:linePitch="360"/>
-    </w:sectPr>
   </w:body>
 </w:document>
 </file>

</xml_diff>